<commit_message>
both the single and batch processing is woking now
</commit_message>
<xml_diff>
--- a/backend/ssformat.docx
+++ b/backend/ssformat.docx
@@ -332,7 +332,7 @@
                 <w:position w:val="-1"/>
                 <w:lang w:val="en-US"/>
               </w:rPr>
-              <w:t>E</w:t>
+              <w:t>PS</w:t>
             </w:r>
           </w:p>
         </w:tc>
@@ -464,7 +464,7 @@
                 <w:position w:val="-1"/>
                 <w:lang w:val="en-US"/>
               </w:rPr>
-              <w:t>{E}</w:t>
+              <w:t>{PS}</w:t>
             </w:r>
           </w:p>
         </w:tc>
@@ -496,7 +496,25 @@
                 <w:position w:val="-1"/>
                 <w:lang w:val="en-US"/>
               </w:rPr>
-              <w:t>{OT}</w:t>
+              <w:t>{OT</w:t>
+            </w:r>
+            <w:r>
+              <w:rPr>
+                <w:rFonts w:eastAsia="Times New Roman" w:cstheme="minorHAnsi"/>
+                <w:b/>
+                <w:position w:val="-1"/>
+                <w:lang w:val="en-US"/>
+              </w:rPr>
+              <w:t xml:space="preserve"> (Days)</w:t>
+            </w:r>
+            <w:r>
+              <w:rPr>
+                <w:rFonts w:eastAsia="Times New Roman" w:cstheme="minorHAnsi"/>
+                <w:b/>
+                <w:position w:val="-1"/>
+                <w:lang w:val="en-US"/>
+              </w:rPr>
+              <w:t>}</w:t>
             </w:r>
           </w:p>
         </w:tc>
@@ -4241,7 +4259,7 @@
 </file>
 
 <file path=customXml/itemProps1.xml><?xml version="1.0" encoding="utf-8"?>
-<ds:datastoreItem xmlns:ds="http://schemas.openxmlformats.org/officeDocument/2006/customXml" ds:itemID="{A5429B4B-EA2C-40C6-AA36-88A32E433F9A}">
+<ds:datastoreItem xmlns:ds="http://schemas.openxmlformats.org/officeDocument/2006/customXml" ds:itemID="{B9A7C331-56A0-4634-9EFA-065C9BDC35B3}">
   <ds:schemaRefs>
     <ds:schemaRef ds:uri="http://schemas.openxmlformats.org/officeDocument/2006/bibliography"/>
   </ds:schemaRefs>

</xml_diff>